<commit_message>
Finalize 3.5.1 implementation: connector bug docs and test fixtures
Documents the three ballerinax/aws.s3 3.5.1 connector defects (pagination,
SigV4 slash/space encoding) and their workarounds in HANDOVER, and refreshes
extraction test fixtures and docs. This is the last state of the 3.5.1-based
implementation before migrating to the 5.0.0 revamp connector.
</commit_message>
<xml_diff>
--- a/ballerina/tests/resources/sample.docx
+++ b/ballerina/tests/resources/sample.docx
@@ -10,7 +10,29 @@
           <w:sz w:val="24"/>
           <w:sz-cs w:val="24"/>
         </w:rPr>
-        <w:t xml:space="preserve">Ballerina S3 loader DOCX fixture. Extracted from a real Word document.</w:t>
+        <w:t xml:space="preserve">Ballerina S3 loader DOCX fixture. This is the first paragraph.</w:t>
+      </w:r>
+    </w:p>
+    <w:p>
+      <w:pPr/>
+      <w:r>
+        <w:rPr>
+          <w:rFonts w:ascii="Helvetica Light" w:hAnsi="Helvetica Light" w:cs="Helvetica Light"/>
+          <w:sz w:val="24"/>
+          <w:sz-cs w:val="24"/>
+        </w:rPr>
+        <w:t xml:space="preserve"/>
+      </w:r>
+    </w:p>
+    <w:p>
+      <w:pPr/>
+      <w:r>
+        <w:rPr>
+          <w:rFonts w:ascii="Helvetica Light" w:hAnsi="Helvetica Light" w:cs="Helvetica Light"/>
+          <w:sz w:val="24"/>
+          <w:sz-cs w:val="24"/>
+        </w:rPr>
+        <w:t xml:space="preserve">Extracted from a real Word document. This is the second paragraph.</w:t>
       </w:r>
     </w:p>
     <w:sectPr/>

</xml_diff>